<commit_message>
demo-kit: document the standalone VRM path in the process guide
Add a "Two ways in" note to the lifecycle overview and a new section
5.1 "When there's no study — standalone realization" covering when to
start a VR track without a VE study (software already in place), the
trade-off (baselines set in Phase 2 from the live deployment), and a
decision callout. Also thread the standalone case through the Part B
intro, the Intake and Baseline phases, the glossary and the VR
checklist. Regenerate .docx and .pdf. Stays vendor-neutral.

Co-Authored-By: Claude Opus 4.8 <noreply@anthropic.com>
</commit_message>
<xml_diff>
--- a/demo-kit/ValueLifecycle-Process-Guide.docx
+++ b/demo-kit/ValueLifecycle-Process-Guide.docx
@@ -697,6 +697,68 @@
       </w:r>
       <w:r>
         <w:t xml:space="preserve"> through the 7-phase lifecycle to proven value and renewal.</w:t>
+      </w:r>
+    </w:p>
+    <w:p>
+      <w:pPr>
+        <w:pBdr>
+          <w:left w:val="single" w:color="2563EB" w:sz="18" w:space="8"/>
+        </w:pBdr>
+        <w:shd w:fill="EAF4FC" w:val="clear"/>
+        <w:spacing w:after="140" w:before="60"/>
+        <w:ind w:left="360"/>
+      </w:pPr>
+      <w:r>
+        <w:rPr>
+          <w:b/>
+          <w:bCs/>
+          <w:i/>
+          <w:iCs/>
+          <w:color w:val="64748B"/>
+        </w:rPr>
+        <w:t xml:space="preserve">Two ways in.</w:t>
+      </w:r>
+      <w:r>
+        <w:rPr>
+          <w:i/>
+          <w:iCs/>
+          <w:color w:val="64748B"/>
+        </w:rPr>
+        <w:t xml:space="preserve"> Most tracks begin as a VE study and cross the handover gate. But when the software is </w:t>
+      </w:r>
+      <w:r>
+        <w:rPr>
+          <w:i/>
+          <w:iCs/>
+          <w:color w:val="64748B"/>
+        </w:rPr>
+        <w:t xml:space="preserve">already in place</w:t>
+      </w:r>
+      <w:r>
+        <w:rPr>
+          <w:i/>
+          <w:iCs/>
+          <w:color w:val="64748B"/>
+        </w:rPr>
+        <w:t xml:space="preserve"> — there's no new business case to build, you simply need to protect and prove the value of what the customer already owns — you can start a </w:t>
+      </w:r>
+      <w:r>
+        <w:rPr>
+          <w:b/>
+          <w:bCs/>
+          <w:i/>
+          <w:iCs/>
+          <w:color w:val="64748B"/>
+        </w:rPr>
+        <w:t xml:space="preserve">standalone Value Realization track</w:t>
+      </w:r>
+      <w:r>
+        <w:rPr>
+          <w:i/>
+          <w:iCs/>
+          <w:color w:val="64748B"/>
+        </w:rPr>
+        <w:t xml:space="preserve"> directly, with no study behind it. It runs the same 7-phase lifecycle; you set the baselines from the existing deployment instead of inheriting them from a study. See §5.1.</w:t>
       </w:r>
     </w:p>
     <w:p>
@@ -2892,6 +2954,102 @@
     </w:p>
     <w:p>
       <w:pPr>
+        <w:pStyle w:val="Heading2"/>
+        <w:spacing w:after="100" w:before="300"/>
+      </w:pPr>
+      <w:r>
+        <w:rPr>
+          <w:color w:val="2563EB"/>
+        </w:rPr>
+        <w:t xml:space="preserve">5.1 · When there's no study — standalone realization</w:t>
+      </w:r>
+    </w:p>
+    <w:p>
+      <w:pPr>
+        <w:spacing w:after="120" w:line="268"/>
+      </w:pPr>
+      <w:r>
+        <w:t xml:space="preserve">Sometimes there is nothing to hand over. The customer already runs the software and the job is purely to </w:t>
+      </w:r>
+      <w:r>
+        <w:rPr>
+          <w:b/>
+          <w:bCs/>
+        </w:rPr>
+        <w:t xml:space="preserve">realize value from what they own</w:t>
+      </w:r>
+      <w:r>
+        <w:t xml:space="preserve"> — renewal assurance, an adoption rescue, or a value health-check on an installed product. For this, start a </w:t>
+      </w:r>
+      <w:r>
+        <w:rPr>
+          <w:b/>
+          <w:bCs/>
+        </w:rPr>
+        <w:t xml:space="preserve">standalone VR track</w:t>
+      </w:r>
+      <w:r>
+        <w:t xml:space="preserve">: it skips VE and the handover entirely and opens straight into the 7-phase lifecycle.</w:t>
+      </w:r>
+    </w:p>
+    <w:p>
+      <w:pPr>
+        <w:spacing w:after="120" w:line="268"/>
+      </w:pPr>
+      <w:r>
+        <w:t xml:space="preserve">The trade-off is that nothing is pre-seeded. A handover track arrives with work packages, benefits and KPI targets already populated from the study; a standalone track starts blank, so </w:t>
+      </w:r>
+      <w:r>
+        <w:rPr>
+          <w:b/>
+          <w:bCs/>
+        </w:rPr>
+        <w:t xml:space="preserve">you establish the baselines and KPI targets yourself in Phase 2</w:t>
+      </w:r>
+      <w:r>
+        <w:t xml:space="preserve"> from the live deployment. Everything downstream — adoption, execution, value tracking, QBRs, close-out — is identical, and the track is clearly marked as </w:t>
+      </w:r>
+      <w:r>
+        <w:rPr>
+          <w:i/>
+          <w:iCs/>
+        </w:rPr>
+        <w:t xml:space="preserve">standalone</w:t>
+      </w:r>
+      <w:r>
+        <w:t xml:space="preserve"> wherever it appears.</w:t>
+      </w:r>
+    </w:p>
+    <w:p>
+      <w:pPr>
+        <w:pBdr>
+          <w:left w:val="single" w:color="2563EB" w:sz="18" w:space="8"/>
+        </w:pBdr>
+        <w:shd w:fill="EAF4FC" w:val="clear"/>
+        <w:spacing w:after="140" w:before="60"/>
+        <w:ind w:left="360"/>
+      </w:pPr>
+      <w:r>
+        <w:rPr>
+          <w:b/>
+          <w:bCs/>
+          <w:i/>
+          <w:iCs/>
+          <w:color w:val="64748B"/>
+        </w:rPr>
+        <w:t xml:space="preserve">When to use which.</w:t>
+      </w:r>
+      <w:r>
+        <w:rPr>
+          <w:i/>
+          <w:iCs/>
+          <w:color w:val="64748B"/>
+        </w:rPr>
+        <w:t xml:space="preserve"> New opportunity with a case to make → run VE and hand over. Existing, installed software you need to prove value from → start a standalone track. Same lifecycle, same proof; only the starting point differs.</w:t>
+      </w:r>
+    </w:p>
+    <w:p>
+      <w:pPr>
         <w:pBdr>
           <w:bottom w:val="single" w:color="CFE0F0" w:sz="6" w:space="1"/>
         </w:pBdr>
@@ -2961,7 +3119,27 @@
         <w:spacing w:after="120" w:line="268"/>
       </w:pPr>
       <w:r>
-        <w:t xml:space="preserve">The realization lifecycle takes the handover to proven, renewed value in seven phases. The pattern is </w:t>
+        <w:t xml:space="preserve">The realization lifecycle takes a track — whether </w:t>
+      </w:r>
+      <w:r>
+        <w:rPr>
+          <w:b/>
+          <w:bCs/>
+        </w:rPr>
+        <w:t xml:space="preserve">handed over from a VE study</w:t>
+      </w:r>
+      <w:r>
+        <w:t xml:space="preserve"> or </w:t>
+      </w:r>
+      <w:r>
+        <w:rPr>
+          <w:b/>
+          <w:bCs/>
+        </w:rPr>
+        <w:t xml:space="preserve">started standalone</w:t>
+      </w:r>
+      <w:r>
+        <w:t xml:space="preserve"> for software already in place (see §5.1) — to proven, renewed value in seven phases. The pattern is </w:t>
       </w:r>
       <w:r>
         <w:rPr>
@@ -3018,7 +3196,17 @@
         <w:t xml:space="preserve">Key activities:</w:t>
       </w:r>
       <w:r>
-        <w:t xml:space="preserve"> confirm the objectives and success criteria carried from handover; introduce the VRM to the customer's operational owners and sponsor; agree the cadence (check-ins, QBRs).</w:t>
+        <w:t xml:space="preserve"> confirm the objectives and success criteria carried from handover (or, for a </w:t>
+      </w:r>
+      <w:r>
+        <w:rPr>
+          <w:b/>
+          <w:bCs/>
+        </w:rPr>
+        <w:t xml:space="preserve">standalone track</w:t>
+      </w:r>
+      <w:r>
+        <w:t xml:space="preserve">, define them here from the customer's goals for the existing deployment); introduce the VRM to the customer's operational owners and sponsor; agree the cadence (check-ins, QBRs).</w:t>
       </w:r>
     </w:p>
     <w:p>
@@ -3105,7 +3293,17 @@
         <w:t xml:space="preserve">Key activities:</w:t>
       </w:r>
       <w:r>
-        <w:t xml:space="preserve"> validate the baselines from the business case against reality; confirm each KPI's data source, frequency and owner; set the measurement up (dashboards, telemetry).</w:t>
+        <w:t xml:space="preserve"> validate the baselines from the business case against reality (a </w:t>
+      </w:r>
+      <w:r>
+        <w:rPr>
+          <w:b/>
+          <w:bCs/>
+        </w:rPr>
+        <w:t xml:space="preserve">standalone track</w:t>
+      </w:r>
+      <w:r>
+        <w:t xml:space="preserve"> has none inherited — capture them from the live deployment now); confirm each KPI's data source, frequency and owner; set the measurement up (dashboards, telemetry).</w:t>
       </w:r>
     </w:p>
     <w:p>
@@ -3125,7 +3323,7 @@
         <w:t xml:space="preserve">Exit criteria:</w:t>
       </w:r>
       <w:r>
-        <w:t xml:space="preserve"> baselines validated; every KPI has a source, a frequency and an owner.</w:t>
+        <w:t xml:space="preserve"> baselines validated (or established, for a standalone track); every KPI has a source, a frequency and an owner.</w:t>
       </w:r>
     </w:p>
     <w:p>
@@ -4781,6 +4979,26 @@
           <w:b/>
           <w:bCs/>
         </w:rPr>
+        <w:t xml:space="preserve">Standalone realization track</w:t>
+      </w:r>
+      <w:r>
+        <w:t xml:space="preserve"> — a VR track started without a VE study, for software already in place; runs the same 7-phase lifecycle, with baselines set from the live deployment rather than inherited from a study.</w:t>
+      </w:r>
+    </w:p>
+    <w:p>
+      <w:pPr>
+        <w:pStyle w:val="ListParagraph"/>
+        <w:numPr>
+          <w:ilvl w:val="0"/>
+          <w:numId w:val="1"/>
+        </w:numPr>
+        <w:spacing w:after="60"/>
+      </w:pPr>
+      <w:r>
+        <w:rPr>
+          <w:b/>
+          <w:bCs/>
+        </w:rPr>
         <w:t xml:space="preserve">Baseline</w:t>
       </w:r>
       <w:r>
@@ -5154,7 +5372,7 @@
         <w:t xml:space="preserve">Intake &amp; alignment</w:t>
       </w:r>
       <w:r>
-        <w:t xml:space="preserve"> — objectives, success criteria, owners and cadence confirmed.</w:t>
+        <w:t xml:space="preserve"> — objectives, success criteria (from handover, or set directly for a standalone track), owners and cadence confirmed.</w:t>
       </w:r>
     </w:p>
     <w:p>
@@ -5178,7 +5396,7 @@
         <w:t xml:space="preserve">Baseline &amp; measurement</w:t>
       </w:r>
       <w:r>
-        <w:t xml:space="preserve"> — baselines validated; every KPI has a source, frequency and owner.</w:t>
+        <w:t xml:space="preserve"> — baselines validated or established; every KPI has a source, frequency and owner.</w:t>
       </w:r>
     </w:p>
     <w:p>

</xml_diff>

<commit_message>
demo-kit: clarify where Customer Success fits in the process guide
Customer Success is adjacent to the VE->handover->VRM process, not a
step in it. Add a CS row to the Roles table, a "Where Customer Success
fits" boundary callout (VRM is time-boxed to a specific value case; CS
owns the ongoing relationship/health/renewal and receives the VRM's
proof), a glossary entry, and a Close-out pointer to hand the proven
outcome to CS. Regenerate .docx and .pdf. Stays vendor-neutral.

Co-Authored-By: Claude Opus 4.8 <noreply@anthropic.com>
</commit_message>
<xml_diff>
--- a/demo-kit/ValueLifecycle-Process-Guide.docx
+++ b/demo-kit/ValueLifecycle-Process-Guide.docx
@@ -1129,6 +1129,67 @@
           <w:p>
             <w:r>
               <w:t xml:space="preserve">From go-live, across the lifecycle</w:t>
+            </w:r>
+          </w:p>
+        </w:tc>
+      </w:tr>
+      <w:tr>
+        <w:tc>
+          <w:tcPr>
+            <w:tcW w:type="dxa" w:w="3120"/>
+            <w:tcMar>
+              <w:top w:type="dxa" w:w="60"/>
+              <w:left w:type="dxa" w:w="110"/>
+              <w:bottom w:type="dxa" w:w="60"/>
+              <w:right w:type="dxa" w:w="110"/>
+            </w:tcMar>
+          </w:tcPr>
+          <w:p>
+            <w:r>
+              <w:rPr>
+                <w:b/>
+                <w:bCs/>
+              </w:rPr>
+              <w:t xml:space="preserve">Customer Success (CSM)</w:t>
+            </w:r>
+          </w:p>
+        </w:tc>
+        <w:tc>
+          <w:tcPr>
+            <w:tcW w:type="dxa" w:w="3120"/>
+            <w:tcMar>
+              <w:top w:type="dxa" w:w="60"/>
+              <w:left w:type="dxa" w:w="110"/>
+              <w:bottom w:type="dxa" w:w="60"/>
+              <w:right w:type="dxa" w:w="110"/>
+            </w:tcMar>
+          </w:tcPr>
+          <w:p>
+            <w:r>
+              <w:t xml:space="preserve">Ongoing account health, adoption &amp; renewal across the whole relationship — </w:t>
+            </w:r>
+            <w:r>
+              <w:rPr>
+                <w:i/>
+                <w:iCs/>
+              </w:rPr>
+              <w:t xml:space="preserve">adjacent to this process, not a step in it</w:t>
+            </w:r>
+          </w:p>
+        </w:tc>
+        <w:tc>
+          <w:tcPr>
+            <w:tcW w:type="dxa" w:w="3120"/>
+            <w:tcMar>
+              <w:top w:type="dxa" w:w="60"/>
+              <w:left w:type="dxa" w:w="110"/>
+              <w:bottom w:type="dxa" w:w="60"/>
+              <w:right w:type="dxa" w:w="110"/>
+            </w:tcMar>
+          </w:tcPr>
+          <w:p>
+            <w:r>
+              <w:t xml:space="preserve">Continuously post-sale; receives the VRM's realized-value proof</w:t>
             </w:r>
           </w:p>
         </w:tc>
@@ -1504,6 +1565,102 @@
     <w:p>
       <w:pPr>
         <w:pBdr>
+          <w:left w:val="single" w:color="2563EB" w:sz="18" w:space="8"/>
+        </w:pBdr>
+        <w:shd w:fill="EAF4FC" w:val="clear"/>
+        <w:spacing w:after="140" w:before="60"/>
+        <w:ind w:left="360"/>
+      </w:pPr>
+      <w:r>
+        <w:rPr>
+          <w:b/>
+          <w:bCs/>
+          <w:i/>
+          <w:iCs/>
+          <w:color w:val="64748B"/>
+        </w:rPr>
+        <w:t xml:space="preserve">Where Customer Success fits.</w:t>
+      </w:r>
+      <w:r>
+        <w:rPr>
+          <w:i/>
+          <w:iCs/>
+          <w:color w:val="64748B"/>
+        </w:rPr>
+        <w:t xml:space="preserve"> Customer Success is </w:t>
+      </w:r>
+      <w:r>
+        <w:rPr>
+          <w:b/>
+          <w:bCs/>
+          <w:i/>
+          <w:iCs/>
+          <w:color w:val="64748B"/>
+        </w:rPr>
+        <w:t xml:space="preserve">adjacent to this process, not a step in it.</w:t>
+      </w:r>
+      <w:r>
+        <w:rPr>
+          <w:i/>
+          <w:iCs/>
+          <w:color w:val="64748B"/>
+        </w:rPr>
+        <w:t xml:space="preserve"> A CSM owns the </w:t>
+      </w:r>
+      <w:r>
+        <w:rPr>
+          <w:i/>
+          <w:iCs/>
+          <w:color w:val="64748B"/>
+        </w:rPr>
+        <w:t xml:space="preserve">ongoing</w:t>
+      </w:r>
+      <w:r>
+        <w:rPr>
+          <w:i/>
+          <w:iCs/>
+          <w:color w:val="64748B"/>
+        </w:rPr>
+        <w:t xml:space="preserve"> relationship, adoption and renewal across everything the customer runs; the </w:t>
+      </w:r>
+      <w:r>
+        <w:rPr>
+          <w:b/>
+          <w:bCs/>
+          <w:i/>
+          <w:iCs/>
+          <w:color w:val="64748B"/>
+        </w:rPr>
+        <w:t xml:space="preserve">VRM is narrower and time-boxed</w:t>
+      </w:r>
+      <w:r>
+        <w:rPr>
+          <w:i/>
+          <w:iCs/>
+          <w:color w:val="64748B"/>
+        </w:rPr>
+        <w:t xml:space="preserve"> — proving the realized value of a </w:t>
+      </w:r>
+      <w:r>
+        <w:rPr>
+          <w:i/>
+          <w:iCs/>
+          <w:color w:val="64748B"/>
+        </w:rPr>
+        <w:t xml:space="preserve">specific</w:t>
+      </w:r>
+      <w:r>
+        <w:rPr>
+          <w:i/>
+          <w:iCs/>
+          <w:color w:val="64748B"/>
+        </w:rPr>
+        <w:t xml:space="preserve"> business case, then closing it out. The two hand off rather than overlap: the VRM's realized-value evidence feeds the CSM's renewal and expansion. Where a team has both, Customer Success often originates a value initiative and pulls in a VRM; at small scale one person wears both hats.</w:t>
+      </w:r>
+    </w:p>
+    <w:p>
+      <w:pPr>
+        <w:pBdr>
           <w:bottom w:val="single" w:color="CFE0F0" w:sz="6" w:space="1"/>
         </w:pBdr>
         <w:spacing w:after="160" w:before="40"/>
@@ -3778,7 +3935,17 @@
         <w:t xml:space="preserve">Key activities:</w:t>
       </w:r>
       <w:r>
-        <w:t xml:space="preserve"> confirm final realized value vs the original business case; record lessons learned; route improvements back into the VE templates and playbooks; tee up the next opportunity.</w:t>
+        <w:t xml:space="preserve"> confirm final realized value vs the original business case; record lessons learned; route improvements back into the VE templates and playbooks; </w:t>
+      </w:r>
+      <w:r>
+        <w:rPr>
+          <w:b/>
+          <w:bCs/>
+        </w:rPr>
+        <w:t xml:space="preserve">hand the proven outcome to Customer Success for ongoing renewal &amp; account health</w:t>
+      </w:r>
+      <w:r>
+        <w:t xml:space="preserve"> (CS owns the continuing relationship — the VRM's proof is its strongest input); tee up the next opportunity.</w:t>
       </w:r>
     </w:p>
     <w:p>
@@ -3798,7 +3965,7 @@
         <w:t xml:space="preserve">Exit criteria:</w:t>
       </w:r>
       <w:r>
-        <w:t xml:space="preserve"> final value confirmed and signed off; lessons captured; next-step identified.</w:t>
+        <w:t xml:space="preserve"> final value confirmed and signed off; lessons captured; ongoing ownership passed to Customer Success; next-step identified.</w:t>
       </w:r>
     </w:p>
     <w:p>
@@ -4919,6 +5086,36 @@
           <w:b/>
           <w:bCs/>
         </w:rPr>
+        <w:t xml:space="preserve">Customer Success (CS / CSM)</w:t>
+      </w:r>
+      <w:r>
+        <w:t xml:space="preserve"> — the ongoing post-sale function that owns account health, adoption and renewal across the whole relationship. </w:t>
+      </w:r>
+      <w:r>
+        <w:rPr>
+          <w:b/>
+          <w:bCs/>
+        </w:rPr>
+        <w:t xml:space="preserve">Adjacent to this process, not a phase in it:</w:t>
+      </w:r>
+      <w:r>
+        <w:t xml:space="preserve"> the VRM proves the value of a specific case and hands the evidence to CS for renewal and continuing health.</w:t>
+      </w:r>
+    </w:p>
+    <w:p>
+      <w:pPr>
+        <w:pStyle w:val="ListParagraph"/>
+        <w:numPr>
+          <w:ilvl w:val="0"/>
+          <w:numId w:val="1"/>
+        </w:numPr>
+        <w:spacing w:after="60"/>
+      </w:pPr>
+      <w:r>
+        <w:rPr>
+          <w:b/>
+          <w:bCs/>
+        </w:rPr>
         <w:t xml:space="preserve">VE Job Plan</w:t>
       </w:r>
       <w:r>

</xml_diff>